<commit_message>
Gestion date des événements
</commit_message>
<xml_diff>
--- a/doc/NotesNRa3_formats.docx
+++ b/doc/NotesNRa3_formats.docx
@@ -45,18 +45,256 @@
           <w:bCs/>
           <w:u w:val="single"/>
         </w:rPr>
+        <w:t> : formats</w:t>
+      </w:r>
+    </w:p>
+    <w:p/>
+    <w:p>
+      <w:r>
+        <w:t>Attention :</w:t>
+      </w:r>
+    </w:p>
+    <w:p>
+      <w:r>
+        <w:t xml:space="preserve">2 types de présentations, selon la présence ou non d’évènements hors naissance / décès / </w:t>
+      </w:r>
+      <w:proofErr w:type="spellStart"/>
+      <w:r>
+        <w:t>baptème</w:t>
+      </w:r>
+      <w:proofErr w:type="spellEnd"/>
+      <w:r>
+        <w:t> :</w:t>
+      </w:r>
+    </w:p>
+    <w:p/>
+    <w:p>
+      <w:r>
+        <w:t xml:space="preserve">Simple : sans rubrique événements : </w:t>
+      </w:r>
+      <w:hyperlink r:id="rId8" w:history="1">
+        <w:r>
+          <w:rPr>
+            <w:rStyle w:val="Lienhypertexte"/>
+          </w:rPr>
+          <w:t>https://gw.geneanet.org/nraibaut2?lang=fr&amp;p=pierre&amp;n=dupont</w:t>
+        </w:r>
+      </w:hyperlink>
+    </w:p>
+    <w:p>
+      <w:r>
+        <w:drawing>
+          <wp:inline distT="0" distB="0" distL="0" distR="0" wp14:anchorId="47009656" wp14:editId="32E0A682">
+            <wp:extent cx="1914795" cy="3179928"/>
+            <wp:effectExtent l="0" t="0" r="0" b="1905"/>
+            <wp:docPr id="2018410024" name="Image 1"/>
+            <wp:cNvGraphicFramePr>
+              <a:graphicFrameLocks xmlns:a="http://schemas.openxmlformats.org/drawingml/2006/main" noChangeAspect="1"/>
+            </wp:cNvGraphicFramePr>
+            <a:graphic xmlns:a="http://schemas.openxmlformats.org/drawingml/2006/main">
+              <a:graphicData uri="http://schemas.openxmlformats.org/drawingml/2006/picture">
+                <pic:pic xmlns:pic="http://schemas.openxmlformats.org/drawingml/2006/picture">
+                  <pic:nvPicPr>
+                    <pic:cNvPr id="2018410024" name=""/>
+                    <pic:cNvPicPr/>
+                  </pic:nvPicPr>
+                  <pic:blipFill>
+                    <a:blip r:embed="rId9"/>
+                    <a:stretch>
+                      <a:fillRect/>
+                    </a:stretch>
+                  </pic:blipFill>
+                  <pic:spPr>
+                    <a:xfrm>
+                      <a:off x="0" y="0"/>
+                      <a:ext cx="1925243" cy="3197279"/>
+                    </a:xfrm>
+                    <a:prstGeom prst="rect">
+                      <a:avLst/>
+                    </a:prstGeom>
+                  </pic:spPr>
+                </pic:pic>
+              </a:graphicData>
+            </a:graphic>
+          </wp:inline>
+        </w:drawing>
+      </w:r>
+    </w:p>
+    <w:p>
+      <w:r>
+        <w:t xml:space="preserve">Avec </w:t>
+      </w:r>
+      <w:r>
+        <w:t>rubrique événements</w:t>
+      </w:r>
+      <w:r>
         <w:t xml:space="preserve"> : </w:t>
       </w:r>
-      <w:r>
-        <w:rPr>
-          <w:b/>
-          <w:bCs/>
-          <w:u w:val="single"/>
-        </w:rPr>
-        <w:t>formats</w:t>
-      </w:r>
-    </w:p>
-    <w:p/>
+      <w:hyperlink r:id="rId10" w:history="1">
+        <w:r>
+          <w:rPr>
+            <w:rStyle w:val="Lienhypertexte"/>
+          </w:rPr>
+          <w:t>https://gw.geneanet.org/nraibaut2?lang=fr&amp;n=dupont&amp;oc=0&amp;p=gerard</w:t>
+        </w:r>
+      </w:hyperlink>
+    </w:p>
+    <w:p>
+      <w:pPr>
+        <w:rPr>
+          <w:noProof/>
+        </w:rPr>
+      </w:pPr>
+      <w:r>
+        <w:drawing>
+          <wp:inline distT="0" distB="0" distL="0" distR="0" wp14:anchorId="5CC49712" wp14:editId="19B84487">
+            <wp:extent cx="1889231" cy="4223982"/>
+            <wp:effectExtent l="0" t="0" r="0" b="5715"/>
+            <wp:docPr id="569821832" name="Image 1"/>
+            <wp:cNvGraphicFramePr>
+              <a:graphicFrameLocks xmlns:a="http://schemas.openxmlformats.org/drawingml/2006/main" noChangeAspect="1"/>
+            </wp:cNvGraphicFramePr>
+            <a:graphic xmlns:a="http://schemas.openxmlformats.org/drawingml/2006/main">
+              <a:graphicData uri="http://schemas.openxmlformats.org/drawingml/2006/picture">
+                <pic:pic xmlns:pic="http://schemas.openxmlformats.org/drawingml/2006/picture">
+                  <pic:nvPicPr>
+                    <pic:cNvPr id="569821832" name=""/>
+                    <pic:cNvPicPr/>
+                  </pic:nvPicPr>
+                  <pic:blipFill>
+                    <a:blip r:embed="rId11"/>
+                    <a:stretch>
+                      <a:fillRect/>
+                    </a:stretch>
+                  </pic:blipFill>
+                  <pic:spPr>
+                    <a:xfrm>
+                      <a:off x="0" y="0"/>
+                      <a:ext cx="1894697" cy="4236203"/>
+                    </a:xfrm>
+                    <a:prstGeom prst="rect">
+                      <a:avLst/>
+                    </a:prstGeom>
+                  </pic:spPr>
+                </pic:pic>
+              </a:graphicData>
+            </a:graphic>
+          </wp:inline>
+        </w:drawing>
+      </w:r>
+      <w:r>
+        <w:rPr>
+          <w:noProof/>
+        </w:rPr>
+        <w:t xml:space="preserve"> </w:t>
+      </w:r>
+      <w:r>
+        <w:drawing>
+          <wp:inline distT="0" distB="0" distL="0" distR="0" wp14:anchorId="43E9E1B8" wp14:editId="2F9F27FE">
+            <wp:extent cx="2192792" cy="2102750"/>
+            <wp:effectExtent l="0" t="0" r="0" b="0"/>
+            <wp:docPr id="369584589" name="Image 1"/>
+            <wp:cNvGraphicFramePr>
+              <a:graphicFrameLocks xmlns:a="http://schemas.openxmlformats.org/drawingml/2006/main" noChangeAspect="1"/>
+            </wp:cNvGraphicFramePr>
+            <a:graphic xmlns:a="http://schemas.openxmlformats.org/drawingml/2006/main">
+              <a:graphicData uri="http://schemas.openxmlformats.org/drawingml/2006/picture">
+                <pic:pic xmlns:pic="http://schemas.openxmlformats.org/drawingml/2006/picture">
+                  <pic:nvPicPr>
+                    <pic:cNvPr id="369584589" name=""/>
+                    <pic:cNvPicPr/>
+                  </pic:nvPicPr>
+                  <pic:blipFill>
+                    <a:blip r:embed="rId12"/>
+                    <a:stretch>
+                      <a:fillRect/>
+                    </a:stretch>
+                  </pic:blipFill>
+                  <pic:spPr>
+                    <a:xfrm>
+                      <a:off x="0" y="0"/>
+                      <a:ext cx="2198976" cy="2108680"/>
+                    </a:xfrm>
+                    <a:prstGeom prst="rect">
+                      <a:avLst/>
+                    </a:prstGeom>
+                  </pic:spPr>
+                </pic:pic>
+              </a:graphicData>
+            </a:graphic>
+          </wp:inline>
+        </w:drawing>
+      </w:r>
+    </w:p>
+    <w:p>
+      <w:pPr>
+        <w:rPr>
+          <w:noProof/>
+        </w:rPr>
+      </w:pPr>
+    </w:p>
+    <w:p>
+      <w:pPr>
+        <w:rPr>
+          <w:noProof/>
+        </w:rPr>
+      </w:pPr>
+      <w:r>
+        <w:rPr>
+          <w:noProof/>
+        </w:rPr>
+        <w:lastRenderedPageBreak/>
+        <w:t xml:space="preserve">Dates : </w:t>
+      </w:r>
+      <w:hyperlink r:id="rId13" w:history="1">
+        <w:r>
+          <w:rPr>
+            <w:rStyle w:val="Lienhypertexte"/>
+            <w:noProof/>
+          </w:rPr>
+          <w:t>https://gw.geneanet.org/nraibaut2?lang=fr&amp;p=jean&amp;n=dates</w:t>
+        </w:r>
+      </w:hyperlink>
+    </w:p>
+    <w:p>
+      <w:r>
+        <w:drawing>
+          <wp:inline distT="0" distB="0" distL="0" distR="0" wp14:anchorId="280E84C8" wp14:editId="3A62981B">
+            <wp:extent cx="1646013" cy="2463421"/>
+            <wp:effectExtent l="0" t="0" r="0" b="0"/>
+            <wp:docPr id="2012783101" name="Image 1"/>
+            <wp:cNvGraphicFramePr>
+              <a:graphicFrameLocks xmlns:a="http://schemas.openxmlformats.org/drawingml/2006/main" noChangeAspect="1"/>
+            </wp:cNvGraphicFramePr>
+            <a:graphic xmlns:a="http://schemas.openxmlformats.org/drawingml/2006/main">
+              <a:graphicData uri="http://schemas.openxmlformats.org/drawingml/2006/picture">
+                <pic:pic xmlns:pic="http://schemas.openxmlformats.org/drawingml/2006/picture">
+                  <pic:nvPicPr>
+                    <pic:cNvPr id="2012783101" name=""/>
+                    <pic:cNvPicPr/>
+                  </pic:nvPicPr>
+                  <pic:blipFill>
+                    <a:blip r:embed="rId14"/>
+                    <a:stretch>
+                      <a:fillRect/>
+                    </a:stretch>
+                  </pic:blipFill>
+                  <pic:spPr>
+                    <a:xfrm>
+                      <a:off x="0" y="0"/>
+                      <a:ext cx="1655090" cy="2477005"/>
+                    </a:xfrm>
+                    <a:prstGeom prst="rect">
+                      <a:avLst/>
+                    </a:prstGeom>
+                  </pic:spPr>
+                </pic:pic>
+              </a:graphicData>
+            </a:graphic>
+          </wp:inline>
+        </w:drawing>
+      </w:r>
+    </w:p>
     <w:p/>
     <w:p/>
     <w:p/>
@@ -86,7 +324,7 @@
       </w:r>
     </w:p>
     <w:p>
-      <w:hyperlink r:id="rId8" w:history="1">
+      <w:hyperlink r:id="rId15" w:history="1">
         <w:r>
           <w:rPr>
             <w:rStyle w:val="Lienhypertexte"/>
@@ -116,7 +354,7 @@
                     <pic:cNvPicPr/>
                   </pic:nvPicPr>
                   <pic:blipFill>
-                    <a:blip r:embed="rId9"/>
+                    <a:blip r:embed="rId16"/>
                     <a:stretch>
                       <a:fillRect/>
                     </a:stretch>
@@ -366,7 +604,7 @@
       <w:r>
         <w:t>="</w:t>
       </w:r>
-      <w:hyperlink r:id="rId10" w:history="1">
+      <w:hyperlink r:id="rId17" w:history="1">
         <w:r>
           <w:rPr>
             <w:rStyle w:val="Lienhypertexte"/>
@@ -545,7 +783,7 @@
       <w:r>
         <w:t>="</w:t>
       </w:r>
-      <w:hyperlink r:id="rId11" w:history="1">
+      <w:hyperlink r:id="rId18" w:history="1">
         <w:r>
           <w:rPr>
             <w:rStyle w:val="Lienhypertexte"/>
@@ -646,7 +884,7 @@
       </w:r>
     </w:p>
     <w:p>
-      <w:hyperlink r:id="rId12" w:history="1">
+      <w:hyperlink r:id="rId19" w:history="1">
         <w:r>
           <w:rPr>
             <w:rStyle w:val="Lienhypertexte"/>
@@ -676,7 +914,7 @@
                     <pic:cNvPicPr/>
                   </pic:nvPicPr>
                   <pic:blipFill>
-                    <a:blip r:embed="rId13"/>
+                    <a:blip r:embed="rId20"/>
                     <a:stretch>
                       <a:fillRect/>
                     </a:stretch>
@@ -1190,7 +1428,7 @@
       <w:r>
         <w:t>="</w:t>
       </w:r>
-      <w:hyperlink r:id="rId14" w:history="1">
+      <w:hyperlink r:id="rId21" w:history="1">
         <w:r>
           <w:rPr>
             <w:rStyle w:val="Lienhypertexte"/>
@@ -1460,6 +1698,7 @@
         <w:pStyle w:val="Listing"/>
       </w:pPr>
       <w:r>
+        <w:lastRenderedPageBreak/>
         <w:t>&lt;/</w:t>
       </w:r>
       <w:r>
@@ -1591,7 +1830,7 @@
       <w:r>
         <w:t>="</w:t>
       </w:r>
-      <w:hyperlink r:id="rId15" w:history="1">
+      <w:hyperlink r:id="rId22" w:history="1">
         <w:r>
           <w:rPr>
             <w:rStyle w:val="Lienhypertexte"/>
@@ -1762,7 +2001,7 @@
       </w:r>
     </w:p>
     <w:p>
-      <w:hyperlink r:id="rId16" w:history="1">
+      <w:hyperlink r:id="rId23" w:history="1">
         <w:r>
           <w:rPr>
             <w:rStyle w:val="Lienhypertexte"/>
@@ -1781,7 +2020,6 @@
         <w:rPr>
           <w:noProof/>
         </w:rPr>
-        <w:lastRenderedPageBreak/>
         <w:drawing>
           <wp:inline distT="0" distB="0" distL="0" distR="0" wp14:anchorId="238EFE88" wp14:editId="3FC76C31">
             <wp:extent cx="2315688" cy="3038386"/>
@@ -1798,7 +2036,7 @@
                     <pic:cNvPicPr/>
                   </pic:nvPicPr>
                   <pic:blipFill>
-                    <a:blip r:embed="rId17"/>
+                    <a:blip r:embed="rId24"/>
                     <a:stretch>
                       <a:fillRect/>
                     </a:stretch>
@@ -1844,7 +2082,7 @@
                     <pic:cNvPicPr/>
                   </pic:nvPicPr>
                   <pic:blipFill>
-                    <a:blip r:embed="rId18"/>
+                    <a:blip r:embed="rId25"/>
                     <a:stretch>
                       <a:fillRect/>
                     </a:stretch>
@@ -2135,7 +2373,7 @@
       </w:r>
     </w:p>
     <w:p>
-      <w:hyperlink r:id="rId19" w:history="1">
+      <w:hyperlink r:id="rId26" w:history="1">
         <w:r>
           <w:rPr>
             <w:rStyle w:val="Lienhypertexte"/>
@@ -2149,6 +2387,7 @@
         <w:rPr>
           <w:noProof/>
         </w:rPr>
+        <w:lastRenderedPageBreak/>
         <w:drawing>
           <wp:anchor distT="0" distB="0" distL="114300" distR="114300" simplePos="0" relativeHeight="251659264" behindDoc="0" locked="0" layoutInCell="1" allowOverlap="1" wp14:anchorId="6D6EDF01" wp14:editId="516E1183">
             <wp:simplePos x="688769" y="6507678"/>
@@ -2173,7 +2412,7 @@
                     <pic:cNvPicPr/>
                   </pic:nvPicPr>
                   <pic:blipFill>
-                    <a:blip r:embed="rId20">
+                    <a:blip r:embed="rId27">
                       <a:extLst>
                         <a:ext uri="{28A0092B-C50C-407E-A947-70E740481C1C}">
                           <a14:useLocalDpi xmlns:a14="http://schemas.microsoft.com/office/drawing/2010/main" val="0"/>
@@ -2876,7 +3115,7 @@
                     <pic:cNvPicPr/>
                   </pic:nvPicPr>
                   <pic:blipFill>
-                    <a:blip r:embed="rId21"/>
+                    <a:blip r:embed="rId28"/>
                     <a:stretch>
                       <a:fillRect/>
                     </a:stretch>
@@ -3716,6 +3955,7 @@
         <w:pStyle w:val="Listing"/>
       </w:pPr>
       <w:r>
+        <w:lastRenderedPageBreak/>
         <w:t>&lt;</w:t>
       </w:r>
       <w:proofErr w:type="gramStart"/>
@@ -3790,7 +4030,7 @@
       <w:r>
         <w:t>="</w:t>
       </w:r>
-      <w:hyperlink r:id="rId22" w:history="1">
+      <w:hyperlink r:id="rId29" w:history="1">
         <w:r>
           <w:rPr>
             <w:rStyle w:val="Lienhypertexte"/>
@@ -4370,7 +4610,6 @@
         <w:rPr>
           <w:noProof/>
         </w:rPr>
-        <w:lastRenderedPageBreak/>
         <w:drawing>
           <wp:inline distT="0" distB="0" distL="0" distR="0" wp14:anchorId="462C9620" wp14:editId="37882809">
             <wp:extent cx="2131621" cy="1728628"/>
@@ -4387,7 +4626,7 @@
                     <pic:cNvPicPr/>
                   </pic:nvPicPr>
                   <pic:blipFill>
-                    <a:blip r:embed="rId23"/>
+                    <a:blip r:embed="rId30"/>
                     <a:stretch>
                       <a:fillRect/>
                     </a:stretch>
@@ -4415,7 +4654,7 @@
       </w:r>
     </w:p>
     <w:p>
-      <w:hyperlink r:id="rId24" w:history="1">
+      <w:hyperlink r:id="rId31" w:history="1">
         <w:r>
           <w:rPr>
             <w:rStyle w:val="Lienhypertexte"/>
@@ -4445,7 +4684,7 @@
                     <pic:cNvPicPr/>
                   </pic:nvPicPr>
                   <pic:blipFill>
-                    <a:blip r:embed="rId25"/>
+                    <a:blip r:embed="rId32"/>
                     <a:stretch>
                       <a:fillRect/>
                     </a:stretch>
@@ -4472,7 +4711,7 @@
       </w:r>
     </w:p>
     <w:p>
-      <w:hyperlink r:id="rId26" w:history="1">
+      <w:hyperlink r:id="rId33" w:history="1">
         <w:r>
           <w:rPr>
             <w:rStyle w:val="Lienhypertexte"/>
@@ -4502,7 +4741,7 @@
                     <pic:cNvPicPr/>
                   </pic:nvPicPr>
                   <pic:blipFill>
-                    <a:blip r:embed="rId27"/>
+                    <a:blip r:embed="rId34"/>
                     <a:stretch>
                       <a:fillRect/>
                     </a:stretch>
@@ -4727,7 +4966,7 @@
       </w:r>
     </w:p>
     <w:p>
-      <w:hyperlink r:id="rId28" w:history="1">
+      <w:hyperlink r:id="rId35" w:history="1">
         <w:r>
           <w:rPr>
             <w:rStyle w:val="Lienhypertexte"/>
@@ -4741,7 +4980,6 @@
         <w:rPr>
           <w:noProof/>
         </w:rPr>
-        <w:lastRenderedPageBreak/>
         <w:drawing>
           <wp:inline distT="0" distB="0" distL="0" distR="0" wp14:anchorId="2F3CFEB6" wp14:editId="520464E8">
             <wp:extent cx="2066306" cy="1284818"/>
@@ -4758,7 +4996,7 @@
                     <pic:cNvPicPr/>
                   </pic:nvPicPr>
                   <pic:blipFill>
-                    <a:blip r:embed="rId29"/>
+                    <a:blip r:embed="rId36"/>
                     <a:stretch>
                       <a:fillRect/>
                     </a:stretch>
@@ -4782,7 +5020,7 @@
     <w:p/>
     <w:p/>
     <w:sectPr>
-      <w:headerReference w:type="default" r:id="rId30"/>
+      <w:headerReference w:type="default" r:id="rId37"/>
       <w:pgSz w:w="11906" w:h="16838"/>
       <w:pgMar w:top="1440" w:right="1080" w:bottom="1440" w:left="1080" w:header="708" w:footer="708" w:gutter="0"/>
       <w:cols w:space="708"/>

</xml_diff>

<commit_message>
Gestion des événements multiples
</commit_message>
<xml_diff>
--- a/doc/NotesNRa3_formats.docx
+++ b/doc/NotesNRa3_formats.docx
@@ -6899,6 +6899,9 @@
     </w:p>
     <w:p>
       <w:r>
+        <w:rPr>
+          <w:noProof/>
+        </w:rPr>
         <w:drawing>
           <wp:anchor distT="0" distB="0" distL="114300" distR="114300" simplePos="0" relativeHeight="251661312" behindDoc="0" locked="0" layoutInCell="1" allowOverlap="1" wp14:anchorId="43DFC6F1" wp14:editId="63C24682">
             <wp:simplePos x="914400" y="5827594"/>
@@ -13301,8 +13304,176 @@
     </w:p>
     <w:p/>
     <w:p/>
+    <w:p/>
+    <w:p/>
+    <w:p>
+      <w:r>
+        <w:t>Date entre :</w:t>
+      </w:r>
+    </w:p>
+    <w:p>
+      <w:hyperlink r:id="rId96" w:history="1">
+        <w:r>
+          <w:rPr>
+            <w:rStyle w:val="Lienhypertexte"/>
+          </w:rPr>
+          <w:t>https://gw.geneanet.org/nraibaut2_w?lang=fr&amp;p=jean&amp;n=dates&amp;type=fiche</w:t>
+        </w:r>
+      </w:hyperlink>
+    </w:p>
+    <w:p>
+      <w:proofErr w:type="gramStart"/>
+      <w:r>
+        <w:t>l’import</w:t>
+      </w:r>
+      <w:proofErr w:type="gramEnd"/>
+      <w:r>
+        <w:t xml:space="preserve"> </w:t>
+      </w:r>
+      <w:proofErr w:type="spellStart"/>
+      <w:r>
+        <w:t>Geneanet</w:t>
+      </w:r>
+      <w:proofErr w:type="spellEnd"/>
+      <w:r>
+        <w:t xml:space="preserve"> ne distingue pas période / laps de temps :</w:t>
+      </w:r>
+    </w:p>
+    <w:p>
+      <w:r>
+        <w:drawing>
+          <wp:inline distT="0" distB="0" distL="0" distR="0" wp14:anchorId="02483461" wp14:editId="3704D150">
+            <wp:extent cx="2917947" cy="3419061"/>
+            <wp:effectExtent l="0" t="0" r="0" b="0"/>
+            <wp:docPr id="1874847473" name="Image 1"/>
+            <wp:cNvGraphicFramePr>
+              <a:graphicFrameLocks xmlns:a="http://schemas.openxmlformats.org/drawingml/2006/main" noChangeAspect="1"/>
+            </wp:cNvGraphicFramePr>
+            <a:graphic xmlns:a="http://schemas.openxmlformats.org/drawingml/2006/main">
+              <a:graphicData uri="http://schemas.openxmlformats.org/drawingml/2006/picture">
+                <pic:pic xmlns:pic="http://schemas.openxmlformats.org/drawingml/2006/picture">
+                  <pic:nvPicPr>
+                    <pic:cNvPr id="1874847473" name=""/>
+                    <pic:cNvPicPr/>
+                  </pic:nvPicPr>
+                  <pic:blipFill>
+                    <a:blip r:embed="rId97"/>
+                    <a:stretch>
+                      <a:fillRect/>
+                    </a:stretch>
+                  </pic:blipFill>
+                  <pic:spPr>
+                    <a:xfrm>
+                      <a:off x="0" y="0"/>
+                      <a:ext cx="2925692" cy="3428136"/>
+                    </a:xfrm>
+                    <a:prstGeom prst="rect">
+                      <a:avLst/>
+                    </a:prstGeom>
+                  </pic:spPr>
+                </pic:pic>
+              </a:graphicData>
+            </a:graphic>
+          </wp:inline>
+        </w:drawing>
+      </w:r>
+    </w:p>
+    <w:p/>
+    <w:p>
+      <w:r>
+        <w:t>2 DATE BEF 1 JAN 1834</w:t>
+      </w:r>
+      <w:r>
+        <w:t xml:space="preserve"> = </w:t>
+      </w:r>
+      <w:r>
+        <w:t>laps de temps</w:t>
+      </w:r>
+      <w:r>
+        <w:t xml:space="preserve"> avant</w:t>
+      </w:r>
+    </w:p>
+    <w:p>
+      <w:r>
+        <w:t>2 DATE BET 1 JAN 1835 AND 31 DEC 1837</w:t>
+      </w:r>
+      <w:r>
+        <w:t xml:space="preserve"> = </w:t>
+      </w:r>
+      <w:r>
+        <w:t>laps de temps entre</w:t>
+      </w:r>
+    </w:p>
+    <w:p>
+      <w:r>
+        <w:t>2 DATE AFT 1 JAN 1837</w:t>
+      </w:r>
+      <w:r>
+        <w:t xml:space="preserve"> </w:t>
+      </w:r>
+      <w:r>
+        <w:t xml:space="preserve">= </w:t>
+      </w:r>
+      <w:r>
+        <w:t>laps de temps</w:t>
+      </w:r>
+      <w:r>
+        <w:t xml:space="preserve"> </w:t>
+      </w:r>
+      <w:r>
+        <w:t>après</w:t>
+      </w:r>
+    </w:p>
+    <w:p/>
+    <w:p>
+      <w:r>
+        <w:t>2 DATE TO 1 JAN 1849</w:t>
+      </w:r>
+      <w:r>
+        <w:t xml:space="preserve"> = </w:t>
+      </w:r>
+      <w:r>
+        <w:t>Période jusqu'au</w:t>
+      </w:r>
+    </w:p>
+    <w:p>
+      <w:r>
+        <w:t>2 DATE FROM 1 JAN 1850 TO 1 JAN 1851</w:t>
+      </w:r>
+      <w:r>
+        <w:t xml:space="preserve"> = </w:t>
+      </w:r>
+      <w:r>
+        <w:t>Période du au</w:t>
+      </w:r>
+    </w:p>
+    <w:p>
+      <w:r>
+        <w:t>2 DATE FROM 1 JAN 1852</w:t>
+      </w:r>
+      <w:r>
+        <w:t xml:space="preserve"> = </w:t>
+      </w:r>
+      <w:r>
+        <w:t>Période du</w:t>
+      </w:r>
+    </w:p>
+    <w:p/>
+    <w:p/>
+    <w:p>
+      <w:r>
+        <w:t>Date julienne :</w:t>
+      </w:r>
+    </w:p>
+    <w:p/>
+    <w:p>
+      <w:r>
+        <w:t>2 DATE @#DJULIAN@ 1580</w:t>
+      </w:r>
+    </w:p>
+    <w:p/>
     <w:sectPr>
-      <w:headerReference w:type="default" r:id="rId96"/>
+      <w:headerReference w:type="default" r:id="rId98"/>
       <w:pgSz w:w="11906" w:h="16838"/>
       <w:pgMar w:top="1440" w:right="1080" w:bottom="1440" w:left="1080" w:header="708" w:footer="708" w:gutter="0"/>
       <w:cols w:space="708"/>

</xml_diff>

<commit_message>
Traitement balises html dans les sources
</commit_message>
<xml_diff>
--- a/doc/NotesNRa3_formats.docx
+++ b/doc/NotesNRa3_formats.docx
@@ -19300,10 +19300,7 @@
       </w:r>
       <w:proofErr w:type="gramEnd"/>
       <w:r>
-        <w:t xml:space="preserve">) </w:t>
-      </w:r>
-      <w:r>
-        <w:t>Espaces multiples :</w:t>
+        <w:t>) Espaces multiples :</w:t>
       </w:r>
     </w:p>
     <w:p>
@@ -20887,6 +20884,9 @@
     </w:p>
     <w:p>
       <w:r>
+        <w:rPr>
+          <w:noProof/>
+        </w:rPr>
         <w:drawing>
           <wp:inline distT="0" distB="0" distL="0" distR="0" wp14:anchorId="0E8255E3" wp14:editId="4AE8E750">
             <wp:extent cx="5025483" cy="625478"/>
@@ -21194,6 +21194,9 @@
     <w:p/>
     <w:p>
       <w:r>
+        <w:rPr>
+          <w:noProof/>
+        </w:rPr>
         <w:drawing>
           <wp:inline distT="0" distB="0" distL="0" distR="0" wp14:anchorId="56DB7B8E" wp14:editId="7BBD9B79">
             <wp:extent cx="6188710" cy="1452880"/>
@@ -21249,6 +21252,9 @@
     </w:p>
     <w:p>
       <w:r>
+        <w:rPr>
+          <w:noProof/>
+        </w:rPr>
         <w:drawing>
           <wp:inline distT="0" distB="0" distL="0" distR="0" wp14:anchorId="44B0793F" wp14:editId="72CAD28E">
             <wp:extent cx="6188710" cy="671830"/>
@@ -21508,31 +21514,7 @@
           <w:rPr>
             <w:rStyle w:val="Lienhypertexte"/>
           </w:rPr>
-          <w:t>https://gw.geneanet.org/d</w:t>
-        </w:r>
-        <w:r>
-          <w:rPr>
-            <w:rStyle w:val="Lienhypertexte"/>
-          </w:rPr>
-          <w:t>a</w:t>
-        </w:r>
-        <w:r>
-          <w:rPr>
-            <w:rStyle w:val="Lienhypertexte"/>
-          </w:rPr>
-          <w:t>n</w:t>
-        </w:r>
-        <w:r>
-          <w:rPr>
-            <w:rStyle w:val="Lienhypertexte"/>
-          </w:rPr>
-          <w:t>i</w:t>
-        </w:r>
-        <w:r>
-          <w:rPr>
-            <w:rStyle w:val="Lienhypertexte"/>
-          </w:rPr>
-          <w:t>elr13?lang=fr&amp;n=nicolas&amp;oc=0&amp;p=etienne+henri</w:t>
+          <w:t>https://gw.geneanet.org/danielr13?lang=fr&amp;n=nicolas&amp;oc=0&amp;p=etienne+henri</w:t>
         </w:r>
       </w:hyperlink>
     </w:p>
@@ -21543,6 +21525,9 @@
     </w:p>
     <w:p>
       <w:r>
+        <w:rPr>
+          <w:noProof/>
+        </w:rPr>
         <w:drawing>
           <wp:inline distT="0" distB="0" distL="0" distR="0" wp14:anchorId="18D031D8" wp14:editId="11C04933">
             <wp:extent cx="4942258" cy="2552266"/>
@@ -21610,6 +21595,9 @@
     </w:p>
     <w:p>
       <w:r>
+        <w:rPr>
+          <w:noProof/>
+        </w:rPr>
         <w:drawing>
           <wp:inline distT="0" distB="0" distL="0" distR="0" wp14:anchorId="2D291AE1" wp14:editId="7C2489C1">
             <wp:extent cx="4288829" cy="2227146"/>
@@ -21676,25 +21664,16 @@
           <w:rPr>
             <w:rStyle w:val="Lienhypertexte"/>
           </w:rPr>
-          <w:t>https://gw.geneanet.org</w:t>
-        </w:r>
-        <w:r>
-          <w:rPr>
-            <w:rStyle w:val="Lienhypertexte"/>
-          </w:rPr>
-          <w:t>/</w:t>
-        </w:r>
-        <w:r>
-          <w:rPr>
-            <w:rStyle w:val="Lienhypertexte"/>
-          </w:rPr>
-          <w:t>danielr13?lang=fr&amp;p=henri+marie+amedee&amp;n=nicolas&amp;type=fiche</w:t>
+          <w:t>https://gw.geneanet.org/danielr13?lang=fr&amp;p=henri+marie+amedee&amp;n=nicolas&amp;type=fiche</w:t>
         </w:r>
       </w:hyperlink>
       <w:r>
         <w:br/>
       </w:r>
       <w:r>
+        <w:rPr>
+          <w:noProof/>
+        </w:rPr>
         <w:drawing>
           <wp:inline distT="0" distB="0" distL="0" distR="0" wp14:anchorId="5C70F420" wp14:editId="64B850B4">
             <wp:extent cx="3740284" cy="2261594"/>
@@ -23769,6 +23748,9 @@
     <w:p/>
     <w:p>
       <w:r>
+        <w:rPr>
+          <w:noProof/>
+        </w:rPr>
         <w:drawing>
           <wp:inline distT="0" distB="0" distL="0" distR="0" wp14:anchorId="703660D6" wp14:editId="781DE142">
             <wp:extent cx="4950069" cy="2556300"/>
@@ -24312,10 +24294,1121 @@
       <w:proofErr w:type="gramEnd"/>
     </w:p>
     <w:p/>
+    <w:p>
+      <w:r>
+        <w:t>05/04/26 : erreur dates invalides vue par l’import Ancestris :</w:t>
+      </w:r>
+    </w:p>
+    <w:p>
+      <w:r>
+        <w:t>jpifieec92.n=</w:t>
+      </w:r>
+      <w:proofErr w:type="spellStart"/>
+      <w:proofErr w:type="gramStart"/>
+      <w:r>
+        <w:t>nicolas.oc</w:t>
+      </w:r>
+      <w:proofErr w:type="spellEnd"/>
+      <w:r>
+        <w:t>=1.p</w:t>
+      </w:r>
+      <w:proofErr w:type="gramEnd"/>
+      <w:r>
+        <w:t>=</w:t>
+      </w:r>
+      <w:proofErr w:type="spellStart"/>
+      <w:r>
+        <w:t>etienne_ancestris.ged</w:t>
+      </w:r>
+      <w:proofErr w:type="spellEnd"/>
+    </w:p>
+    <w:p>
+      <w:r>
+        <w:drawing>
+          <wp:inline distT="0" distB="0" distL="0" distR="0" wp14:anchorId="11E3278B" wp14:editId="51C2C35E">
+            <wp:extent cx="6188710" cy="876300"/>
+            <wp:effectExtent l="0" t="0" r="2540" b="0"/>
+            <wp:docPr id="636140304" name="Image 1"/>
+            <wp:cNvGraphicFramePr>
+              <a:graphicFrameLocks xmlns:a="http://schemas.openxmlformats.org/drawingml/2006/main" noChangeAspect="1"/>
+            </wp:cNvGraphicFramePr>
+            <a:graphic xmlns:a="http://schemas.openxmlformats.org/drawingml/2006/main">
+              <a:graphicData uri="http://schemas.openxmlformats.org/drawingml/2006/picture">
+                <pic:pic xmlns:pic="http://schemas.openxmlformats.org/drawingml/2006/picture">
+                  <pic:nvPicPr>
+                    <pic:cNvPr id="636140304" name=""/>
+                    <pic:cNvPicPr/>
+                  </pic:nvPicPr>
+                  <pic:blipFill>
+                    <a:blip r:embed="rId135"/>
+                    <a:stretch>
+                      <a:fillRect/>
+                    </a:stretch>
+                  </pic:blipFill>
+                  <pic:spPr>
+                    <a:xfrm>
+                      <a:off x="0" y="0"/>
+                      <a:ext cx="6188710" cy="876300"/>
+                    </a:xfrm>
+                    <a:prstGeom prst="rect">
+                      <a:avLst/>
+                    </a:prstGeom>
+                  </pic:spPr>
+                </pic:pic>
+              </a:graphicData>
+            </a:graphic>
+          </wp:inline>
+        </w:drawing>
+      </w:r>
+    </w:p>
+    <w:p>
+      <w:hyperlink r:id="rId136" w:history="1">
+        <w:r>
+          <w:rPr>
+            <w:rStyle w:val="Lienhypertexte"/>
+          </w:rPr>
+          <w:t>https://gw.geneanet.org/jpifieec92?lang=fr&amp;p=etienne+ou+pierre&amp;n=mauche&amp;type=fiche</w:t>
+        </w:r>
+      </w:hyperlink>
+    </w:p>
+    <w:p>
+      <w:r>
+        <w:drawing>
+          <wp:inline distT="0" distB="0" distL="0" distR="0" wp14:anchorId="565B80B8" wp14:editId="3EB96417">
+            <wp:extent cx="3153588" cy="1413710"/>
+            <wp:effectExtent l="0" t="0" r="8890" b="0"/>
+            <wp:docPr id="1287807858" name="Image 1"/>
+            <wp:cNvGraphicFramePr>
+              <a:graphicFrameLocks xmlns:a="http://schemas.openxmlformats.org/drawingml/2006/main" noChangeAspect="1"/>
+            </wp:cNvGraphicFramePr>
+            <a:graphic xmlns:a="http://schemas.openxmlformats.org/drawingml/2006/main">
+              <a:graphicData uri="http://schemas.openxmlformats.org/drawingml/2006/picture">
+                <pic:pic xmlns:pic="http://schemas.openxmlformats.org/drawingml/2006/picture">
+                  <pic:nvPicPr>
+                    <pic:cNvPr id="1287807858" name=""/>
+                    <pic:cNvPicPr/>
+                  </pic:nvPicPr>
+                  <pic:blipFill>
+                    <a:blip r:embed="rId137"/>
+                    <a:stretch>
+                      <a:fillRect/>
+                    </a:stretch>
+                  </pic:blipFill>
+                  <pic:spPr>
+                    <a:xfrm>
+                      <a:off x="0" y="0"/>
+                      <a:ext cx="3165801" cy="1419185"/>
+                    </a:xfrm>
+                    <a:prstGeom prst="rect">
+                      <a:avLst/>
+                    </a:prstGeom>
+                  </pic:spPr>
+                </pic:pic>
+              </a:graphicData>
+            </a:graphic>
+          </wp:inline>
+        </w:drawing>
+      </w:r>
+    </w:p>
+    <w:p>
+      <w:proofErr w:type="gramStart"/>
+      <w:r>
+        <w:t>dans</w:t>
+      </w:r>
+      <w:proofErr w:type="gramEnd"/>
+      <w:r>
+        <w:t xml:space="preserve"> GED </w:t>
+      </w:r>
+      <w:r>
+        <w:t>jpifieec92.n=</w:t>
+      </w:r>
+      <w:proofErr w:type="spellStart"/>
+      <w:proofErr w:type="gramStart"/>
+      <w:r>
+        <w:t>nicolas.oc</w:t>
+      </w:r>
+      <w:proofErr w:type="spellEnd"/>
+      <w:r>
+        <w:t>=1.p</w:t>
+      </w:r>
+      <w:proofErr w:type="gramEnd"/>
+      <w:r>
+        <w:t>=</w:t>
+      </w:r>
+      <w:proofErr w:type="spellStart"/>
+      <w:r>
+        <w:t>etienne_ancestris.ged</w:t>
+      </w:r>
+      <w:proofErr w:type="spellEnd"/>
+      <w:r>
+        <w:t> :</w:t>
+      </w:r>
+    </w:p>
+    <w:p>
+      <w:pPr>
+        <w:pStyle w:val="Listing"/>
+      </w:pPr>
+    </w:p>
+    <w:p>
+      <w:pPr>
+        <w:pStyle w:val="Listing"/>
+      </w:pPr>
+      <w:r>
+        <w:t>0 @I00080@ INDI</w:t>
+      </w:r>
+    </w:p>
+    <w:p>
+      <w:pPr>
+        <w:pStyle w:val="Listing"/>
+      </w:pPr>
+      <w:r>
+        <w:t>1 NAME Etienne Ou Pierre /MAUCHE/</w:t>
+      </w:r>
+    </w:p>
+    <w:p>
+      <w:pPr>
+        <w:pStyle w:val="Listing"/>
+      </w:pPr>
+      <w:r>
+        <w:t>2 GIVN Etienne, Ou, Pierre</w:t>
+      </w:r>
+    </w:p>
+    <w:p>
+      <w:pPr>
+        <w:pStyle w:val="Listing"/>
+      </w:pPr>
+      <w:r>
+        <w:t>2 SURN MAUCHE</w:t>
+      </w:r>
+    </w:p>
+    <w:p>
+      <w:pPr>
+        <w:pStyle w:val="Listing"/>
+      </w:pPr>
+      <w:r>
+        <w:t>1 SEX M</w:t>
+      </w:r>
+    </w:p>
+    <w:p>
+      <w:pPr>
+        <w:pStyle w:val="Listing"/>
+      </w:pPr>
+      <w:r>
+        <w:t>1 BIRT</w:t>
+      </w:r>
+    </w:p>
+    <w:p>
+      <w:pPr>
+        <w:pStyle w:val="Listing"/>
+      </w:pPr>
+      <w:r>
+        <w:rPr>
+          <w:highlight w:val="yellow"/>
+        </w:rPr>
+        <w:t>2 DATE ABT / /</w:t>
+      </w:r>
+    </w:p>
+    <w:p>
+      <w:pPr>
+        <w:pStyle w:val="Listing"/>
+      </w:pPr>
+      <w:r>
+        <w:t>2 PLAC Eyragues, 13036, Bouches du Rhône, Provence-Alpes-Côte-d'Azur, France</w:t>
+      </w:r>
+      <w:proofErr w:type="gramStart"/>
+      <w:r>
+        <w:t>, ,</w:t>
+      </w:r>
+      <w:proofErr w:type="gramEnd"/>
+    </w:p>
+    <w:p>
+      <w:pPr>
+        <w:pStyle w:val="Listing"/>
+      </w:pPr>
+      <w:r>
+        <w:t>...</w:t>
+      </w:r>
+    </w:p>
+    <w:p>
+      <w:pPr>
+        <w:pStyle w:val="Listing"/>
+      </w:pPr>
+      <w:r>
+        <w:t>0 @F00040@ FAM</w:t>
+      </w:r>
+    </w:p>
+    <w:p>
+      <w:pPr>
+        <w:pStyle w:val="Listing"/>
+      </w:pPr>
+      <w:r>
+        <w:t>1 HUSB @I00080@</w:t>
+      </w:r>
+    </w:p>
+    <w:p>
+      <w:pPr>
+        <w:pStyle w:val="Listing"/>
+      </w:pPr>
+      <w:r>
+        <w:t>1 WIFE @I00081@</w:t>
+      </w:r>
+    </w:p>
+    <w:p>
+      <w:pPr>
+        <w:pStyle w:val="Listing"/>
+      </w:pPr>
+      <w:r>
+        <w:t>1 MARR</w:t>
+      </w:r>
+    </w:p>
+    <w:p>
+      <w:pPr>
+        <w:pStyle w:val="Listing"/>
+      </w:pPr>
+      <w:r>
+        <w:rPr>
+          <w:highlight w:val="yellow"/>
+        </w:rPr>
+        <w:t xml:space="preserve">2 DATE ABT </w:t>
+      </w:r>
+      <w:proofErr w:type="spellStart"/>
+      <w:r>
+        <w:rPr>
+          <w:highlight w:val="yellow"/>
+        </w:rPr>
+        <w:t>ABT</w:t>
+      </w:r>
+      <w:proofErr w:type="spellEnd"/>
+    </w:p>
     <w:p/>
     <w:p/>
+    <w:p>
+      <w:r>
+        <w:t xml:space="preserve">Import </w:t>
+      </w:r>
+      <w:r>
+        <w:t>bsacco2.n=</w:t>
+      </w:r>
+      <w:proofErr w:type="spellStart"/>
+      <w:proofErr w:type="gramStart"/>
+      <w:r>
+        <w:t>jullian.oc</w:t>
+      </w:r>
+      <w:proofErr w:type="spellEnd"/>
+      <w:r>
+        <w:t>=0.p</w:t>
+      </w:r>
+      <w:proofErr w:type="gramEnd"/>
+      <w:r>
+        <w:t>=</w:t>
+      </w:r>
+      <w:proofErr w:type="spellStart"/>
+      <w:r>
+        <w:t>gilette.ged</w:t>
+      </w:r>
+      <w:proofErr w:type="spellEnd"/>
+      <w:r>
+        <w:t> :</w:t>
+      </w:r>
+    </w:p>
+    <w:p>
+      <w:r>
+        <w:drawing>
+          <wp:inline distT="0" distB="0" distL="0" distR="0" wp14:anchorId="0195EC4D" wp14:editId="174A67D8">
+            <wp:extent cx="6188710" cy="1054100"/>
+            <wp:effectExtent l="0" t="0" r="2540" b="0"/>
+            <wp:docPr id="1472499476" name="Image 1"/>
+            <wp:cNvGraphicFramePr>
+              <a:graphicFrameLocks xmlns:a="http://schemas.openxmlformats.org/drawingml/2006/main" noChangeAspect="1"/>
+            </wp:cNvGraphicFramePr>
+            <a:graphic xmlns:a="http://schemas.openxmlformats.org/drawingml/2006/main">
+              <a:graphicData uri="http://schemas.openxmlformats.org/drawingml/2006/picture">
+                <pic:pic xmlns:pic="http://schemas.openxmlformats.org/drawingml/2006/picture">
+                  <pic:nvPicPr>
+                    <pic:cNvPr id="1472499476" name=""/>
+                    <pic:cNvPicPr/>
+                  </pic:nvPicPr>
+                  <pic:blipFill>
+                    <a:blip r:embed="rId138"/>
+                    <a:stretch>
+                      <a:fillRect/>
+                    </a:stretch>
+                  </pic:blipFill>
+                  <pic:spPr>
+                    <a:xfrm>
+                      <a:off x="0" y="0"/>
+                      <a:ext cx="6188710" cy="1054100"/>
+                    </a:xfrm>
+                    <a:prstGeom prst="rect">
+                      <a:avLst/>
+                    </a:prstGeom>
+                  </pic:spPr>
+                </pic:pic>
+              </a:graphicData>
+            </a:graphic>
+          </wp:inline>
+        </w:drawing>
+      </w:r>
+    </w:p>
+    <w:p>
+      <w:r>
+        <w:t>bsacco2.n=</w:t>
+      </w:r>
+      <w:proofErr w:type="spellStart"/>
+      <w:proofErr w:type="gramStart"/>
+      <w:r>
+        <w:t>jullian.oc</w:t>
+      </w:r>
+      <w:proofErr w:type="spellEnd"/>
+      <w:r>
+        <w:t>=0.p</w:t>
+      </w:r>
+      <w:proofErr w:type="gramEnd"/>
+      <w:r>
+        <w:t>=</w:t>
+      </w:r>
+      <w:proofErr w:type="spellStart"/>
+      <w:r>
+        <w:t>gilette.ged</w:t>
+      </w:r>
+      <w:proofErr w:type="spellEnd"/>
+      <w:r>
+        <w:t> :</w:t>
+      </w:r>
+    </w:p>
+    <w:p>
+      <w:pPr>
+        <w:pStyle w:val="Listing"/>
+      </w:pPr>
+    </w:p>
+    <w:p>
+      <w:pPr>
+        <w:pStyle w:val="Listing"/>
+      </w:pPr>
+      <w:r>
+        <w:t>0 @I00001@ INDI</w:t>
+      </w:r>
+    </w:p>
+    <w:p>
+      <w:pPr>
+        <w:pStyle w:val="Listing"/>
+      </w:pPr>
+      <w:r>
+        <w:t xml:space="preserve">1 NAME </w:t>
+      </w:r>
+      <w:r>
+        <w:rPr>
+          <w:highlight w:val="yellow"/>
+        </w:rPr>
+        <w:t>Gilette /JULLIAN/</w:t>
+      </w:r>
+    </w:p>
+    <w:p>
+      <w:pPr>
+        <w:pStyle w:val="Listing"/>
+      </w:pPr>
+      <w:r>
+        <w:t>2 GIVN Gilette</w:t>
+      </w:r>
+    </w:p>
+    <w:p>
+      <w:pPr>
+        <w:pStyle w:val="Listing"/>
+      </w:pPr>
+      <w:r>
+        <w:t>2 SURN JULLIAN</w:t>
+      </w:r>
+    </w:p>
+    <w:p>
+      <w:pPr>
+        <w:pStyle w:val="Listing"/>
+      </w:pPr>
+      <w:r>
+        <w:t>1 SEX F</w:t>
+      </w:r>
+    </w:p>
+    <w:p>
+      <w:pPr>
+        <w:pStyle w:val="Listing"/>
+      </w:pPr>
+      <w:r>
+        <w:t>1 BIRT</w:t>
+      </w:r>
+    </w:p>
+    <w:p>
+      <w:pPr>
+        <w:pStyle w:val="Listing"/>
+      </w:pPr>
+      <w:r>
+        <w:t>2 DATE BET 1585 AND 1590</w:t>
+      </w:r>
+    </w:p>
+    <w:p>
+      <w:pPr>
+        <w:pStyle w:val="Listing"/>
+      </w:pPr>
+      <w:r>
+        <w:t xml:space="preserve">2 PLAC </w:t>
+      </w:r>
+      <w:proofErr w:type="gramStart"/>
+      <w:r>
+        <w:t>BOULBON ?,</w:t>
+      </w:r>
+      <w:proofErr w:type="gramEnd"/>
+      <w:r>
+        <w:t xml:space="preserve"> 13 BOUCHES DU RHONE</w:t>
+      </w:r>
+    </w:p>
+    <w:p>
+      <w:pPr>
+        <w:pStyle w:val="Listing"/>
+      </w:pPr>
+      <w:r>
+        <w:t>1 DEAT</w:t>
+      </w:r>
+    </w:p>
+    <w:p>
+      <w:pPr>
+        <w:pStyle w:val="Listing"/>
+      </w:pPr>
+      <w:r>
+        <w:t>2 DATE AFT 1635</w:t>
+      </w:r>
+    </w:p>
+    <w:p>
+      <w:pPr>
+        <w:pStyle w:val="Listing"/>
+      </w:pPr>
+      <w:r>
+        <w:t xml:space="preserve">2 PLAC </w:t>
+      </w:r>
+      <w:proofErr w:type="gramStart"/>
+      <w:r>
+        <w:t>BOULBON ?,</w:t>
+      </w:r>
+      <w:proofErr w:type="gramEnd"/>
+      <w:r>
+        <w:t xml:space="preserve"> 13 BOUCHES DU RHONE</w:t>
+      </w:r>
+    </w:p>
+    <w:p>
+      <w:pPr>
+        <w:pStyle w:val="Listing"/>
+      </w:pPr>
+      <w:r>
+        <w:t>1 SOUR @S00001@</w:t>
+      </w:r>
+    </w:p>
+    <w:p>
+      <w:pPr>
+        <w:pStyle w:val="Listing"/>
+      </w:pPr>
+      <w:r>
+        <w:t>1 FAMC @F00001@</w:t>
+      </w:r>
+    </w:p>
+    <w:p>
+      <w:pPr>
+        <w:pStyle w:val="Listing"/>
+      </w:pPr>
+      <w:r>
+        <w:t>0 @S00001@ SOUR</w:t>
+      </w:r>
+    </w:p>
+    <w:p>
+      <w:pPr>
+        <w:pStyle w:val="Listing"/>
+      </w:pPr>
+      <w:r>
+        <w:t>1 TITL https://gw.geneanet.org/bsacco2?lang=fr&amp;n=jullian&amp;oc=0&amp;p=gilette&amp;type=fiche</w:t>
+      </w:r>
+    </w:p>
+    <w:p>
+      <w:pPr>
+        <w:pStyle w:val="Listing"/>
+      </w:pPr>
+      <w:r>
+        <w:t xml:space="preserve">1 TEXT - Née entre 1585 et 1590 - </w:t>
+      </w:r>
+      <w:proofErr w:type="gramStart"/>
+      <w:r>
+        <w:t>BOULBON ?,</w:t>
+      </w:r>
+      <w:proofErr w:type="gramEnd"/>
+      <w:r>
+        <w:t xml:space="preserve"> 13 BOUCHES DU RHONE</w:t>
+      </w:r>
+    </w:p>
+    <w:p>
+      <w:pPr>
+        <w:pStyle w:val="Listing"/>
+      </w:pPr>
+      <w:r>
+        <w:t xml:space="preserve">2 CONT - Décédée après 1635 - </w:t>
+      </w:r>
+      <w:proofErr w:type="gramStart"/>
+      <w:r>
+        <w:t>BOULBON ?,</w:t>
+      </w:r>
+      <w:proofErr w:type="gramEnd"/>
+      <w:r>
+        <w:t xml:space="preserve"> 13 BOUCHES DU RHONE</w:t>
+      </w:r>
+    </w:p>
+    <w:p>
+      <w:pPr>
+        <w:pStyle w:val="Listing"/>
+        <w:rPr>
+          <w:highlight w:val="yellow"/>
+        </w:rPr>
+      </w:pPr>
+      <w:r>
+        <w:rPr>
+          <w:highlight w:val="yellow"/>
+        </w:rPr>
+        <w:t>2 CONT Sources : SACCO BIAGI Gedcom_02_13_2024 [</w:t>
+      </w:r>
+    </w:p>
+    <w:p>
+      <w:pPr>
+        <w:pStyle w:val="Listing"/>
+        <w:rPr>
+          <w:highlight w:val="yellow"/>
+        </w:rPr>
+      </w:pPr>
+      <w:r>
+        <w:rPr>
+          <w:highlight w:val="yellow"/>
+        </w:rPr>
+        <w:t>2 CONT \- Olivier LA BARRE - Famille La Barre Web Site (Smart Match)</w:t>
+      </w:r>
+    </w:p>
+    <w:p>
+      <w:pPr>
+        <w:pStyle w:val="Listing"/>
+        <w:rPr>
+          <w:highlight w:val="yellow"/>
+        </w:rPr>
+      </w:pPr>
+      <w:r>
+        <w:rPr>
+          <w:highlight w:val="yellow"/>
+        </w:rPr>
+        <w:t xml:space="preserve">2 CONT \- Filae Family Trees - Gilette </w:t>
+      </w:r>
+      <w:proofErr w:type="spellStart"/>
+      <w:r>
+        <w:rPr>
+          <w:highlight w:val="yellow"/>
+        </w:rPr>
+        <w:t>JULLIAN&amp;</w:t>
+      </w:r>
+      <w:proofErr w:type="gramStart"/>
+      <w:r>
+        <w:rPr>
+          <w:highlight w:val="yellow"/>
+        </w:rPr>
+        <w:t>lt;br</w:t>
+      </w:r>
+      <w:proofErr w:type="gramEnd"/>
+      <w:r>
+        <w:rPr>
+          <w:highlight w:val="yellow"/>
+        </w:rPr>
+        <w:t>&amp;</w:t>
+      </w:r>
+      <w:proofErr w:type="gramStart"/>
+      <w:r>
+        <w:rPr>
+          <w:highlight w:val="yellow"/>
+        </w:rPr>
+        <w:t>gt;Husband</w:t>
+      </w:r>
+      <w:proofErr w:type="spellEnd"/>
+      <w:proofErr w:type="gramEnd"/>
+      <w:r>
+        <w:rPr>
+          <w:highlight w:val="yellow"/>
+        </w:rPr>
+        <w:t>: &lt;a&gt;Pierre</w:t>
+      </w:r>
+    </w:p>
+    <w:p>
+      <w:pPr>
+        <w:pStyle w:val="Listing"/>
+        <w:rPr>
+          <w:highlight w:val="yellow"/>
+        </w:rPr>
+      </w:pPr>
+      <w:r>
+        <w:rPr>
+          <w:highlight w:val="yellow"/>
+        </w:rPr>
+        <w:t>2 CONT SYBILLE&lt;/a&gt;&amp;</w:t>
+      </w:r>
+      <w:proofErr w:type="spellStart"/>
+      <w:proofErr w:type="gramStart"/>
+      <w:r>
+        <w:rPr>
+          <w:highlight w:val="yellow"/>
+        </w:rPr>
+        <w:t>lt;br</w:t>
+      </w:r>
+      <w:proofErr w:type="gramEnd"/>
+      <w:r>
+        <w:rPr>
+          <w:highlight w:val="yellow"/>
+        </w:rPr>
+        <w:t>&amp;</w:t>
+      </w:r>
+      <w:proofErr w:type="gramStart"/>
+      <w:r>
+        <w:rPr>
+          <w:highlight w:val="yellow"/>
+        </w:rPr>
+        <w:t>gt;Son</w:t>
+      </w:r>
+      <w:proofErr w:type="spellEnd"/>
+      <w:proofErr w:type="gramEnd"/>
+      <w:r>
+        <w:rPr>
+          <w:highlight w:val="yellow"/>
+        </w:rPr>
+        <w:t>: &lt;a&gt;</w:t>
+      </w:r>
+      <w:proofErr w:type="spellStart"/>
+      <w:r>
+        <w:rPr>
+          <w:highlight w:val="yellow"/>
+        </w:rPr>
+        <w:t>Animon</w:t>
+      </w:r>
+      <w:proofErr w:type="spellEnd"/>
+      <w:r>
+        <w:rPr>
+          <w:highlight w:val="yellow"/>
+        </w:rPr>
+        <w:t xml:space="preserve"> SYBILLE&lt;/a&gt; \- Record - </w:t>
+      </w:r>
+      <w:proofErr w:type="gramStart"/>
+      <w:r>
+        <w:rPr>
+          <w:highlight w:val="yellow"/>
+        </w:rPr>
+        <w:t>14100:257600541:</w:t>
+      </w:r>
+      <w:proofErr w:type="gramEnd"/>
+    </w:p>
+    <w:p>
+      <w:pPr>
+        <w:pStyle w:val="Listing"/>
+      </w:pPr>
+      <w:r>
+        <w:rPr>
+          <w:highlight w:val="yellow"/>
+        </w:rPr>
+        <w:t xml:space="preserve">2 </w:t>
+      </w:r>
+      <w:proofErr w:type="gramStart"/>
+      <w:r>
+        <w:rPr>
+          <w:highlight w:val="yellow"/>
+        </w:rPr>
+        <w:t>CONT ]</w:t>
+      </w:r>
+      <w:proofErr w:type="gramEnd"/>
+    </w:p>
+    <w:p>
+      <w:pPr>
+        <w:pStyle w:val="Listing"/>
+      </w:pPr>
+    </w:p>
+    <w:p/>
+    <w:p>
+      <w:r>
+        <w:drawing>
+          <wp:inline distT="0" distB="0" distL="0" distR="0" wp14:anchorId="29B40EAC" wp14:editId="672BF629">
+            <wp:extent cx="6188710" cy="899795"/>
+            <wp:effectExtent l="0" t="0" r="2540" b="0"/>
+            <wp:docPr id="1685196327" name="Image 1"/>
+            <wp:cNvGraphicFramePr>
+              <a:graphicFrameLocks xmlns:a="http://schemas.openxmlformats.org/drawingml/2006/main" noChangeAspect="1"/>
+            </wp:cNvGraphicFramePr>
+            <a:graphic xmlns:a="http://schemas.openxmlformats.org/drawingml/2006/main">
+              <a:graphicData uri="http://schemas.openxmlformats.org/drawingml/2006/picture">
+                <pic:pic xmlns:pic="http://schemas.openxmlformats.org/drawingml/2006/picture">
+                  <pic:nvPicPr>
+                    <pic:cNvPr id="1685196327" name=""/>
+                    <pic:cNvPicPr/>
+                  </pic:nvPicPr>
+                  <pic:blipFill>
+                    <a:blip r:embed="rId139"/>
+                    <a:stretch>
+                      <a:fillRect/>
+                    </a:stretch>
+                  </pic:blipFill>
+                  <pic:spPr>
+                    <a:xfrm>
+                      <a:off x="0" y="0"/>
+                      <a:ext cx="6188710" cy="899795"/>
+                    </a:xfrm>
+                    <a:prstGeom prst="rect">
+                      <a:avLst/>
+                    </a:prstGeom>
+                  </pic:spPr>
+                </pic:pic>
+              </a:graphicData>
+            </a:graphic>
+          </wp:inline>
+        </w:drawing>
+      </w:r>
+    </w:p>
+    <w:p>
+      <w:pPr>
+        <w:pStyle w:val="Paragraphedeliste"/>
+        <w:numPr>
+          <w:ilvl w:val="0"/>
+          <w:numId w:val="8"/>
+        </w:numPr>
+        <w:rPr>
+          <w:highlight w:val="green"/>
+        </w:rPr>
+      </w:pPr>
+      <w:proofErr w:type="gramStart"/>
+      <w:r>
+        <w:rPr>
+          <w:highlight w:val="green"/>
+        </w:rPr>
+        <w:t>corrigé</w:t>
+      </w:r>
+      <w:proofErr w:type="gramEnd"/>
+    </w:p>
+    <w:p/>
+    <w:p/>
+    <w:p>
+      <w:r>
+        <w:t xml:space="preserve">Import </w:t>
+      </w:r>
+      <w:r>
+        <w:t>bigoudi2018.n=</w:t>
+      </w:r>
+      <w:proofErr w:type="spellStart"/>
+      <w:proofErr w:type="gramStart"/>
+      <w:r>
+        <w:t>ginoux.oc</w:t>
+      </w:r>
+      <w:proofErr w:type="spellEnd"/>
+      <w:r>
+        <w:t>=0.p</w:t>
+      </w:r>
+      <w:proofErr w:type="gramEnd"/>
+      <w:r>
+        <w:t>=</w:t>
+      </w:r>
+      <w:proofErr w:type="spellStart"/>
+      <w:r>
+        <w:t>antoinette.ged</w:t>
+      </w:r>
+      <w:proofErr w:type="spellEnd"/>
+      <w:r>
+        <w:t> :</w:t>
+      </w:r>
+    </w:p>
+    <w:p>
+      <w:r>
+        <w:drawing>
+          <wp:inline distT="0" distB="0" distL="0" distR="0" wp14:anchorId="12EECC6D" wp14:editId="3F6082E2">
+            <wp:extent cx="6188710" cy="694055"/>
+            <wp:effectExtent l="0" t="0" r="2540" b="0"/>
+            <wp:docPr id="1316786933" name="Image 1"/>
+            <wp:cNvGraphicFramePr>
+              <a:graphicFrameLocks xmlns:a="http://schemas.openxmlformats.org/drawingml/2006/main" noChangeAspect="1"/>
+            </wp:cNvGraphicFramePr>
+            <a:graphic xmlns:a="http://schemas.openxmlformats.org/drawingml/2006/main">
+              <a:graphicData uri="http://schemas.openxmlformats.org/drawingml/2006/picture">
+                <pic:pic xmlns:pic="http://schemas.openxmlformats.org/drawingml/2006/picture">
+                  <pic:nvPicPr>
+                    <pic:cNvPr id="1316786933" name=""/>
+                    <pic:cNvPicPr/>
+                  </pic:nvPicPr>
+                  <pic:blipFill>
+                    <a:blip r:embed="rId140"/>
+                    <a:stretch>
+                      <a:fillRect/>
+                    </a:stretch>
+                  </pic:blipFill>
+                  <pic:spPr>
+                    <a:xfrm>
+                      <a:off x="0" y="0"/>
+                      <a:ext cx="6188710" cy="694055"/>
+                    </a:xfrm>
+                    <a:prstGeom prst="rect">
+                      <a:avLst/>
+                    </a:prstGeom>
+                  </pic:spPr>
+                </pic:pic>
+              </a:graphicData>
+            </a:graphic>
+          </wp:inline>
+        </w:drawing>
+      </w:r>
+    </w:p>
+    <w:p>
+      <w:pPr>
+        <w:pStyle w:val="Listing"/>
+      </w:pPr>
+      <w:r>
+        <w:t>0 @I00010@ INDI</w:t>
+      </w:r>
+    </w:p>
+    <w:p>
+      <w:pPr>
+        <w:pStyle w:val="Listing"/>
+      </w:pPr>
+      <w:r>
+        <w:t>1 NAME Jean /GINOUX/</w:t>
+      </w:r>
+    </w:p>
+    <w:p>
+      <w:pPr>
+        <w:pStyle w:val="Listing"/>
+      </w:pPr>
+      <w:r>
+        <w:lastRenderedPageBreak/>
+        <w:t>2 GIVN Jean</w:t>
+      </w:r>
+    </w:p>
+    <w:p>
+      <w:pPr>
+        <w:pStyle w:val="Listing"/>
+      </w:pPr>
+      <w:r>
+        <w:t>2 SURN GINOUX</w:t>
+      </w:r>
+    </w:p>
+    <w:p>
+      <w:pPr>
+        <w:pStyle w:val="Listing"/>
+      </w:pPr>
+      <w:r>
+        <w:t>1 SEX M</w:t>
+      </w:r>
+    </w:p>
+    <w:p>
+      <w:pPr>
+        <w:pStyle w:val="Listing"/>
+      </w:pPr>
+      <w:r>
+        <w:t>1 DEAT</w:t>
+      </w:r>
+    </w:p>
+    <w:p>
+      <w:pPr>
+        <w:pStyle w:val="Listing"/>
+      </w:pPr>
+      <w:r>
+        <w:rPr>
+          <w:highlight w:val="yellow"/>
+        </w:rPr>
+        <w:t>2 DATE 11 DEC 1597 OU LE 31 MAR 1600</w:t>
+      </w:r>
+    </w:p>
+    <w:p>
+      <w:pPr>
+        <w:pStyle w:val="Listing"/>
+      </w:pPr>
+      <w:r>
+        <w:t>2 PLAC Châteaurenard, 13027, Bouches-du-Rhône, Provence-Alpes-Côte d'Azur, France</w:t>
+      </w:r>
+      <w:proofErr w:type="gramStart"/>
+      <w:r>
+        <w:t>, ,</w:t>
+      </w:r>
+      <w:proofErr w:type="gramEnd"/>
+      <w:r>
+        <w:t xml:space="preserve"> </w:t>
+      </w:r>
+    </w:p>
+    <w:p>
+      <w:pPr>
+        <w:pStyle w:val="Listing"/>
+      </w:pPr>
+      <w:r>
+        <w:t>2 NOTE @N00004@</w:t>
+      </w:r>
+    </w:p>
+    <w:p>
+      <w:pPr>
+        <w:pStyle w:val="Listing"/>
+      </w:pPr>
+      <w:r>
+        <w:t>2 SOUR @S00013@</w:t>
+      </w:r>
+    </w:p>
+    <w:p>
+      <w:pPr>
+        <w:pStyle w:val="Listing"/>
+      </w:pPr>
+      <w:r>
+        <w:t>1 SOUR @S00014@</w:t>
+      </w:r>
+    </w:p>
+    <w:p>
+      <w:pPr>
+        <w:pStyle w:val="Listing"/>
+      </w:pPr>
+      <w:r>
+        <w:t>1 FAMS @F00005@</w:t>
+      </w:r>
+    </w:p>
+    <w:p>
+      <w:pPr>
+        <w:pStyle w:val="Listing"/>
+      </w:pPr>
+      <w:r>
+        <w:t>1 FAMC @F00009@</w:t>
+      </w:r>
+    </w:p>
+    <w:p>
+      <w:pPr>
+        <w:pStyle w:val="Listing"/>
+      </w:pPr>
+      <w:r>
+        <w:t xml:space="preserve">0 @N00004@ NOTE acte sans autre </w:t>
+      </w:r>
+      <w:proofErr w:type="gramStart"/>
+      <w:r>
+        <w:t>référence ,</w:t>
+      </w:r>
+      <w:proofErr w:type="gramEnd"/>
+      <w:r>
+        <w:t xml:space="preserve"> ce n'est </w:t>
+      </w:r>
+      <w:proofErr w:type="spellStart"/>
+      <w:proofErr w:type="gramStart"/>
+      <w:r>
+        <w:t>peut être</w:t>
+      </w:r>
+      <w:proofErr w:type="spellEnd"/>
+      <w:proofErr w:type="gramEnd"/>
+      <w:r>
+        <w:t xml:space="preserve"> pas le bon</w:t>
+      </w:r>
+    </w:p>
+    <w:p>
+      <w:pPr>
+        <w:pStyle w:val="Listing"/>
+      </w:pPr>
+      <w:r>
+        <w:t>0 @S00013@ SOUR</w:t>
+      </w:r>
+    </w:p>
+    <w:p>
+      <w:pPr>
+        <w:pStyle w:val="Listing"/>
+      </w:pPr>
+      <w:r>
+        <w:t xml:space="preserve">1 TITL </w:t>
+      </w:r>
+      <w:proofErr w:type="spellStart"/>
+      <w:r>
+        <w:t>Généprovence</w:t>
+      </w:r>
+      <w:proofErr w:type="spellEnd"/>
+    </w:p>
+    <w:p>
+      <w:pPr>
+        <w:pStyle w:val="Listing"/>
+      </w:pPr>
+      <w:r>
+        <w:t>0 @S00014@ SOUR</w:t>
+      </w:r>
+    </w:p>
+    <w:p>
+      <w:pPr>
+        <w:pStyle w:val="Listing"/>
+      </w:pPr>
+      <w:r>
+        <w:t>1 TITL https://gw.geneanet.org/bigoudi2018?lang=fr&amp;p=jean&amp;n=ginoux&amp;type=fiche</w:t>
+      </w:r>
+    </w:p>
+    <w:p>
+      <w:pPr>
+        <w:pStyle w:val="Listing"/>
+      </w:pPr>
+      <w:r>
+        <w:t xml:space="preserve">1 TEXT - </w:t>
+      </w:r>
+      <w:proofErr w:type="gramStart"/>
+      <w:r>
+        <w:t>surnom:</w:t>
+      </w:r>
+      <w:proofErr w:type="gramEnd"/>
+      <w:r>
+        <w:t xml:space="preserve"> dit le vieux</w:t>
+      </w:r>
+    </w:p>
+    <w:p>
+      <w:pPr>
+        <w:pStyle w:val="Listing"/>
+      </w:pPr>
+      <w:r>
+        <w:t>2 CONT - Décédé le 11 décembre 1597 ou le 31 mars 1600 - Châteaurenard, 13027, Bouches-du-Rhône, Provence-Alpes-Côte d'Azur, France</w:t>
+      </w:r>
+    </w:p>
+    <w:p/>
+    <w:p>
+      <w:hyperlink r:id="rId141" w:history="1">
+        <w:r>
+          <w:rPr>
+            <w:rStyle w:val="Lienhypertexte"/>
+          </w:rPr>
+          <w:t>https://gw.geneanet.org/bigoudi2018?lang=fr&amp;p=jean&amp;n=ginoux&amp;type=fiche</w:t>
+        </w:r>
+      </w:hyperlink>
+    </w:p>
+    <w:p>
+      <w:r>
+        <w:drawing>
+          <wp:inline distT="0" distB="0" distL="0" distR="0" wp14:anchorId="4B5E9298" wp14:editId="5013A606">
+            <wp:extent cx="6188710" cy="1024255"/>
+            <wp:effectExtent l="0" t="0" r="2540" b="4445"/>
+            <wp:docPr id="538011281" name="Image 1"/>
+            <wp:cNvGraphicFramePr>
+              <a:graphicFrameLocks xmlns:a="http://schemas.openxmlformats.org/drawingml/2006/main" noChangeAspect="1"/>
+            </wp:cNvGraphicFramePr>
+            <a:graphic xmlns:a="http://schemas.openxmlformats.org/drawingml/2006/main">
+              <a:graphicData uri="http://schemas.openxmlformats.org/drawingml/2006/picture">
+                <pic:pic xmlns:pic="http://schemas.openxmlformats.org/drawingml/2006/picture">
+                  <pic:nvPicPr>
+                    <pic:cNvPr id="538011281" name=""/>
+                    <pic:cNvPicPr/>
+                  </pic:nvPicPr>
+                  <pic:blipFill>
+                    <a:blip r:embed="rId142"/>
+                    <a:stretch>
+                      <a:fillRect/>
+                    </a:stretch>
+                  </pic:blipFill>
+                  <pic:spPr>
+                    <a:xfrm>
+                      <a:off x="0" y="0"/>
+                      <a:ext cx="6188710" cy="1024255"/>
+                    </a:xfrm>
+                    <a:prstGeom prst="rect">
+                      <a:avLst/>
+                    </a:prstGeom>
+                  </pic:spPr>
+                </pic:pic>
+              </a:graphicData>
+            </a:graphic>
+          </wp:inline>
+        </w:drawing>
+      </w:r>
+    </w:p>
+    <w:p/>
     <w:sectPr>
-      <w:headerReference w:type="default" r:id="rId135"/>
+      <w:headerReference w:type="default" r:id="rId143"/>
       <w:pgSz w:w="11906" w:h="16838"/>
       <w:pgMar w:top="1440" w:right="1080" w:bottom="1440" w:left="1080" w:header="708" w:footer="708" w:gutter="0"/>
       <w:cols w:space="708"/>
@@ -24397,7 +25490,7 @@
       <w:rPr>
         <w:noProof/>
       </w:rPr>
-      <w:t>22/03/2026</w:t>
+      <w:t>29/03/2026</w:t>
     </w:r>
     <w:r>
       <w:fldChar w:fldCharType="end"/>
@@ -25767,6 +26860,7 @@
   <w:style w:type="character" w:default="1" w:styleId="Policepardfaut">
     <w:name w:val="Default Paragraph Font"/>
     <w:uiPriority w:val="1"/>
+    <w:semiHidden/>
     <w:unhideWhenUsed/>
   </w:style>
   <w:style w:type="table" w:default="1" w:styleId="TableauNormal">

</xml_diff>